<commit_message>
Jobs Tracker agreement: fill Workwiz-side terms
Support/notice e-mail, Business-Hours SLA, Azure Communication Services
as e-mail/SMS sub-processor, CBES Start Date 1 Aug 2026, Gaswise
telematics (Kinetic), liability floor, onboarding timings, backup rate.

Co-Authored-By: Claude Fable 5.1 <noreply@anthropic.com>
Claude-Session: https://claude.ai/code/session_01D3BUwhgUWaWyPGkQWqj7G2
</commit_message>
<xml_diff>
--- a/jobstracker/contracts/JobsTracker_Subscription_Agreement_DRAFT_2026-10-16_branded.docx
+++ b/jobstracker/contracts/JobsTracker_Subscription_Agreement_DRAFT_2026-10-16_branded.docx
@@ -942,7 +942,7 @@
           <w:sz w:val="20"/>
           <w:szCs w:val="20"/>
         </w:rPr>
-        <w:t xml:space="preserve"> The Set-up Fee covers: creation of the Customer's tenant with its branding and enabled modules; configuration of work statuses, job types and approval rules; creation of RAMS and other document templates from the Customer's existing documents; mapping to the Customer's payroll export (Sage or as named in the Order Form); import of the Customer's worker, client and open-job data from the files the Customer supplies; and up to [two] remote training sessions for Admin Users.</w:t>
+        <w:t xml:space="preserve"> The Set-up Fee covers: creation of the Customer's tenant with its branding and enabled modules; configuration of work statuses, job types and approval rules; creation of RAMS and other document templates from the Customer's existing documents; mapping to the Customer's payroll export (Sage or as named in the Order Form); import of the Customer's worker, client and open-job data from the files the Customer supplies; and up to two remote training sessions for Admin Users.</w:t>
       </w:r>
     </w:p>
     <w:p>
@@ -973,7 +973,7 @@
           <w:sz w:val="20"/>
           <w:szCs w:val="20"/>
         </w:rPr>
-        <w:t xml:space="preserve"> The Customer shall supply the data, documents and a named decision-maker within [10] Business Days of the Effective Date. Delays in Customer inputs extend the go-live date day for day and do not delay the Start Date by more than [30] days.</w:t>
+        <w:t xml:space="preserve"> The Customer shall supply the data, documents and a named decision-maker within 10 Business Days of the Effective Date. Delays in Customer inputs extend the go-live date day for day and do not delay the Start Date by more than 30 days.</w:t>
       </w:r>
     </w:p>
     <w:p>
@@ -1004,7 +1004,7 @@
           <w:sz w:val="20"/>
           <w:szCs w:val="20"/>
         </w:rPr>
-        <w:t xml:space="preserve"> The Supplier notifies the Customer when set-up is complete. The Customer has [10] Business Days to test and report any failure of the configured Service to match the Order Form. The Supplier corrects reported failures; if none are reported in that period, set-up is accepted.</w:t>
+        <w:t xml:space="preserve"> The Supplier notifies the Customer when set-up is complete. The Customer has 10 Business Days to test and report any failure of the configured Service to match the Order Form. The Supplier corrects reported failures; if none are reported in that period, set-up is accepted.</w:t>
       </w:r>
     </w:p>
     <w:p>
@@ -1730,7 +1730,7 @@
           <w:sz w:val="20"/>
           <w:szCs w:val="20"/>
         </w:rPr>
-        <w:t xml:space="preserve"> The Supplier maintains appropriate technical and organisational measures including encryption in transit and at rest, role-based access, logging of access to Customer Data, and daily backups retained for [30] days. The Supplier notifies the Customer without undue delay, and in any case within 48 hours, of becoming aware of a personal data breach affecting Customer Data.</w:t>
+        <w:t xml:space="preserve"> The Supplier maintains appropriate technical and organisational measures including encryption in transit and at rest, role-based access, logging of access to Customer Data, and daily backups retained for 30 days. The Supplier notifies the Customer without undue delay, and in any case within 48 hours, of becoming aware of a personal data breach affecting Customer Data.</w:t>
       </w:r>
     </w:p>
     <w:p>
@@ -2106,7 +2106,7 @@
           <w:sz w:val="20"/>
           <w:szCs w:val="20"/>
         </w:rPr>
-        <w:t xml:space="preserve"> Subject to 9.3, each party's total liability under or in connection with this Agreement in any 12-month period is limited to the Fees paid or payable by the Customer in that period, or [£10,000] if greater. The cap for the Supplier's breach of clause 7 or Schedule 3 is [twice] that amount.</w:t>
+        <w:t xml:space="preserve"> Subject to 9.3, each party's total liability under or in connection with this Agreement in any 12-month period is limited to the Fees paid or payable by the Customer in that period, or £10,000 if greater. The cap for the Supplier's breach of clause 7 or Schedule 3 is twice that amount.</w:t>
       </w:r>
     </w:p>
     <w:p>
@@ -2792,7 +2792,7 @@
                 <w:sz w:val="18"/>
                 <w:szCs w:val="18"/>
               </w:rPr>
-              <w:t xml:space="preserve">Franck Merlin, Director, Workwiz Limited, [e-mail]</w:t>
+              <w:t xml:space="preserve">Franck Merlin, Director, Workwiz Limited, support@jobstracker.work</w:t>
             </w:r>
           </w:p>
         </w:tc>
@@ -2912,7 +2912,7 @@
                 <w:sz w:val="18"/>
                 <w:szCs w:val="18"/>
               </w:rPr>
-              <w:t xml:space="preserve">[1 August 2026 / 1 November 2026 — choose: back-date to match invoices already issued, or from signature]</w:t>
+              <w:t xml:space="preserve">1 August 2026</w:t>
             </w:r>
           </w:p>
         </w:tc>
@@ -3858,7 +3858,7 @@
                 <w:sz w:val="18"/>
                 <w:szCs w:val="18"/>
               </w:rPr>
-              <w:t xml:space="preserve">Franck Merlin, Director, Workwiz Limited, [e-mail]</w:t>
+              <w:t xml:space="preserve">Franck Merlin, Director, Workwiz Limited, support@jobstracker.work</w:t>
             </w:r>
           </w:p>
         </w:tc>
@@ -4518,7 +4518,7 @@
                 <w:sz w:val="18"/>
                 <w:szCs w:val="18"/>
               </w:rPr>
-              <w:t xml:space="preserve">[Telematics: ______ / none]</w:t>
+              <w:t xml:space="preserve">Telematics: Kinetic vehicle tracking (Customer's existing account)</w:t>
             </w:r>
           </w:p>
         </w:tc>
@@ -5704,7 +5704,7 @@
                 <w:sz w:val="18"/>
                 <w:szCs w:val="18"/>
               </w:rPr>
-              <w:t xml:space="preserve">[E-mail provider]</w:t>
+              <w:t xml:space="preserve">Microsoft Azure Communication Services</w:t>
             </w:r>
           </w:p>
         </w:tc>
@@ -5758,7 +5758,7 @@
                 <w:sz w:val="18"/>
                 <w:szCs w:val="18"/>
               </w:rPr>
-              <w:t xml:space="preserve">[UK/EU]</w:t>
+              <w:t xml:space="preserve">United Kingdom / EU</w:t>
             </w:r>
           </w:p>
         </w:tc>
@@ -5791,7 +5791,7 @@
                 <w:sz w:val="18"/>
                 <w:szCs w:val="18"/>
               </w:rPr>
-              <w:t xml:space="preserve">[SMS provider]</w:t>
+              <w:t xml:space="preserve">Microsoft Azure Communication Services</w:t>
             </w:r>
           </w:p>
         </w:tc>
@@ -5845,7 +5845,7 @@
                 <w:sz w:val="18"/>
                 <w:szCs w:val="18"/>
               </w:rPr>
-              <w:t xml:space="preserve">[UK/EU]</w:t>
+              <w:t xml:space="preserve">United Kingdom / EU</w:t>
             </w:r>
           </w:p>
         </w:tc>
@@ -6296,7 +6296,7 @@
           <w:sz w:val="20"/>
           <w:szCs w:val="20"/>
         </w:rPr>
-        <w:t xml:space="preserve"> By e-mail to [support e-mail] and through the in-app help, Monday to Friday 08:00–18:00 UK time excluding public holidays. Out of hours, Priority 1 incidents may be reported by [phone/SMS to ______].</w:t>
+        <w:t xml:space="preserve"> By e-mail to support@jobstracker.work and through the in-app help, Monday to Friday 08:00–18:00 UK time excluding public holidays (Business Hours). Outside Business Hours the same address is monitored for Priority 1 incidents on a best-efforts basis; response-time commitments run from the start of the next Business Hours.</w:t>
       </w:r>
     </w:p>
     <w:tbl>
@@ -6521,7 +6521,7 @@
                 <w:sz w:val="18"/>
                 <w:szCs w:val="18"/>
               </w:rPr>
-              <w:t xml:space="preserve">1 hour, 24/7</w:t>
+              <w:t xml:space="preserve">1 Business Hour</w:t>
             </w:r>
           </w:p>
         </w:tc>
@@ -6548,7 +6548,7 @@
                 <w:sz w:val="18"/>
                 <w:szCs w:val="18"/>
               </w:rPr>
-              <w:t xml:space="preserve">4 hours</w:t>
+              <w:t xml:space="preserve">4 Business Hours</w:t>
             </w:r>
           </w:p>
         </w:tc>
@@ -6944,7 +6944,7 @@
           <w:sz w:val="20"/>
           <w:szCs w:val="20"/>
         </w:rPr>
-        <w:t xml:space="preserve"> Daily, retained [30] days, stored in the UK. Restoration of Customer Data from backup on the Customer's request, where the loss was not caused by the Supplier, is chargeable at [£__/hour].</w:t>
+        <w:t xml:space="preserve"> Daily, retained 30 days, stored in the UK. Restoration of Customer Data from backup on the Customer's request, where the loss was not caused by the Supplier, is chargeable at £120 per hour.</w:t>
       </w:r>
     </w:p>
     <w:sectPr>

</xml_diff>

<commit_message>
UK & Ireland: deck wording, Gaswise order form (Irish entity, VAT reverse charge), DPA covers EU GDPR
Co-Authored-By: Claude Fable 5.1 <noreply@anthropic.com>
Claude-Session: https://claude.ai/code/session_01D3BUwhgUWaWyPGkQWqj7G2
</commit_message>
<xml_diff>
--- a/jobstracker/contracts/JobsTracker_Subscription_Agreement_DRAFT_2026-10-16_branded.docx
+++ b/jobstracker/contracts/JobsTracker_Subscription_Agreement_DRAFT_2026-10-16_branded.docx
@@ -626,7 +626,7 @@
           <w:sz w:val="20"/>
           <w:szCs w:val="20"/>
         </w:rPr>
-        <w:t xml:space="preserve">: the UK GDPR, the Data Protection Act 2018 and all other applicable UK law on the processing of personal data.</w:t>
+        <w:t xml:space="preserve">: the UK GDPR, the Data Protection Act 2018, and, where the Customer is established in the EU, the EU GDPR, together with all other applicable law on the processing of personal data.</w:t>
       </w:r>
     </w:p>
     <w:p>
@@ -3738,7 +3738,7 @@
                 <w:sz w:val="18"/>
                 <w:szCs w:val="18"/>
               </w:rPr>
-              <w:t xml:space="preserve">Gaswise [full legal name] [Limited], company no. [________], registered office [________]</w:t>
+              <w:t xml:space="preserve">Gaswise [full legal name] [Limited], a company registered in Ireland under CRO number [________], registered office [________], Drogheda, Co. Louth, Ireland; VAT number [IE________]</w:t>
             </w:r>
           </w:p>
         </w:tc>
@@ -4158,7 +4158,7 @@
                 <w:sz w:val="18"/>
                 <w:szCs w:val="18"/>
               </w:rPr>
-              <w:t xml:space="preserve">£2,600 (70 × £30 + 10 × £50)</w:t>
+              <w:t xml:space="preserve">£2,600 (70 × £30 + 10 × £50). All Fees are payable in pounds sterling. The Customer is established in Ireland: UK VAT is not charged and the reverse charge applies; the Customer accounts for Irish VAT</w:t>
             </w:r>
           </w:p>
         </w:tc>
@@ -4726,7 +4726,7 @@
           <w:sz w:val="20"/>
           <w:szCs w:val="20"/>
         </w:rPr>
-        <w:t xml:space="preserve">These terms apply to personal data in Customer Data and are intended to satisfy Article 28(3) UK GDPR.</w:t>
+        <w:t xml:space="preserve">These terms apply to personal data in Customer Data and are intended to satisfy Article 28(3) UK GDPR. Where the Customer is established in the EU (Gaswise), references to UK GDPR include the EU GDPR as it applies to the Customer, and the Supplier's hosting of personal data in the United Kingdom is a transfer made in reliance on the European Commission's adequacy decision for the United Kingdom.</w:t>
       </w:r>
     </w:p>
     <w:p>

</xml_diff>